<commit_message>
Align STF package strictly with call requirements
- Abstract restructured into the six questions the call asks; 495 words
  including title and keywords
- Manuscript brought to 3,590 words incl. references (call: 3,500-4,000),
  results written as fill-in sentences, practitioner insights box added
- APA-style unnumbered headings, anonymised docx metadata for blind review
- Figure 1 as a proper diagram; call-compliance checklist added

Co-Authored-By: Claude Opus 5.5 <noreply@anthropic.com>
Claude-Session: https://claude.ai/code/session_01SPArV4q8dwhv3Npz3wnuCt
</commit_message>
<xml_diff>
--- a/dpp-textile-jbl/01_abstract.docx
+++ b/dpp-textile-jbl/01_abstract.docx
@@ -120,254 +120,8 @@
     </w:p>
     <w:p>
       <w:pPr>
-        <w:pStyle w:val="Subtitle"/>
-      </w:pPr>
-      <w:r>
-        <w:t xml:space="preserve">Abstract</w:t>
-      </w:r>
-      <w:r>
-        <w:t xml:space="preserve"> </w:t>
-      </w:r>
-      <w:r>
-        <w:t xml:space="preserve">submitted</w:t>
-      </w:r>
-      <w:r>
-        <w:t xml:space="preserve"> </w:t>
-      </w:r>
-      <w:r>
-        <w:t xml:space="preserve">to</w:t>
-      </w:r>
-      <w:r>
-        <w:t xml:space="preserve"> </w:t>
-      </w:r>
-      <w:r>
-        <w:t xml:space="preserve">the</w:t>
-      </w:r>
-      <w:r>
-        <w:t xml:space="preserve"> </w:t>
-      </w:r>
-      <w:r>
-        <w:t xml:space="preserve">Journal</w:t>
-      </w:r>
-      <w:r>
-        <w:t xml:space="preserve"> </w:t>
-      </w:r>
-      <w:r>
-        <w:t xml:space="preserve">of</w:t>
-      </w:r>
-      <w:r>
-        <w:t xml:space="preserve"> </w:t>
-      </w:r>
-      <w:r>
-        <w:t xml:space="preserve">Business</w:t>
-      </w:r>
-      <w:r>
-        <w:t xml:space="preserve"> </w:t>
-      </w:r>
-      <w:r>
-        <w:t xml:space="preserve">Logistics</w:t>
-      </w:r>
-      <w:r>
-        <w:t xml:space="preserve"> </w:t>
-      </w:r>
-      <w:r>
-        <w:t xml:space="preserve">Special</w:t>
-      </w:r>
-      <w:r>
-        <w:t xml:space="preserve"> </w:t>
-      </w:r>
-      <w:r>
-        <w:t xml:space="preserve">Topic</w:t>
-      </w:r>
-      <w:r>
-        <w:t xml:space="preserve"> </w:t>
-      </w:r>
-      <w:r>
-        <w:t xml:space="preserve">Forum</w:t>
-      </w:r>
-      <w:r>
-        <w:t xml:space="preserve"> </w:t>
-      </w:r>
-      <w:r>
-        <w:rPr>
-          <w:iCs/>
-          <w:i/>
-        </w:rPr>
-        <w:t xml:space="preserve">To</w:t>
-      </w:r>
-      <w:r>
-        <w:rPr>
-          <w:iCs/>
-          <w:i/>
-        </w:rPr>
-        <w:t xml:space="preserve"> </w:t>
-      </w:r>
-      <w:r>
-        <w:rPr>
-          <w:iCs/>
-          <w:i/>
-        </w:rPr>
-        <w:t xml:space="preserve">the</w:t>
-      </w:r>
-      <w:r>
-        <w:rPr>
-          <w:iCs/>
-          <w:i/>
-        </w:rPr>
-        <w:t xml:space="preserve"> </w:t>
-      </w:r>
-      <w:r>
-        <w:rPr>
-          <w:iCs/>
-          <w:i/>
-        </w:rPr>
-        <w:t xml:space="preserve">Point!</w:t>
-      </w:r>
-      <w:r>
-        <w:rPr>
-          <w:iCs/>
-          <w:i/>
-        </w:rPr>
-        <w:t xml:space="preserve"> </w:t>
-      </w:r>
-      <w:r>
-        <w:rPr>
-          <w:iCs/>
-          <w:i/>
-        </w:rPr>
-        <w:t xml:space="preserve">Supply</w:t>
-      </w:r>
-      <w:r>
-        <w:rPr>
-          <w:iCs/>
-          <w:i/>
-        </w:rPr>
-        <w:t xml:space="preserve"> </w:t>
-      </w:r>
-      <w:r>
-        <w:rPr>
-          <w:iCs/>
-          <w:i/>
-        </w:rPr>
-        <w:t xml:space="preserve">Chain</w:t>
-      </w:r>
-      <w:r>
-        <w:rPr>
-          <w:iCs/>
-          <w:i/>
-        </w:rPr>
-        <w:t xml:space="preserve"> </w:t>
-      </w:r>
-      <w:r>
-        <w:rPr>
-          <w:iCs/>
-          <w:i/>
-        </w:rPr>
-        <w:t xml:space="preserve">Management</w:t>
-      </w:r>
-      <w:r>
-        <w:rPr>
-          <w:iCs/>
-          <w:i/>
-        </w:rPr>
-        <w:t xml:space="preserve"> </w:t>
-      </w:r>
-      <w:r>
-        <w:rPr>
-          <w:iCs/>
-          <w:i/>
-        </w:rPr>
-        <w:t xml:space="preserve">Design:</w:t>
-      </w:r>
-      <w:r>
-        <w:rPr>
-          <w:iCs/>
-          <w:i/>
-        </w:rPr>
-        <w:t xml:space="preserve"> </w:t>
-      </w:r>
-      <w:r>
-        <w:rPr>
-          <w:iCs/>
-          <w:i/>
-        </w:rPr>
-        <w:t xml:space="preserve">Seeking</w:t>
-      </w:r>
-      <w:r>
-        <w:rPr>
-          <w:iCs/>
-          <w:i/>
-        </w:rPr>
-        <w:t xml:space="preserve"> </w:t>
-      </w:r>
-      <w:r>
-        <w:rPr>
-          <w:iCs/>
-          <w:i/>
-        </w:rPr>
-        <w:t xml:space="preserve">Research</w:t>
-      </w:r>
-      <w:r>
-        <w:rPr>
-          <w:iCs/>
-          <w:i/>
-        </w:rPr>
-        <w:t xml:space="preserve"> </w:t>
-      </w:r>
-      <w:r>
-        <w:rPr>
-          <w:iCs/>
-          <w:i/>
-        </w:rPr>
-        <w:t xml:space="preserve">that</w:t>
-      </w:r>
-      <w:r>
-        <w:rPr>
-          <w:iCs/>
-          <w:i/>
-        </w:rPr>
-        <w:t xml:space="preserve"> </w:t>
-      </w:r>
-      <w:r>
-        <w:rPr>
-          <w:iCs/>
-          <w:i/>
-        </w:rPr>
-        <w:t xml:space="preserve">Resonates</w:t>
-      </w:r>
-      <w:r>
-        <w:t xml:space="preserve"> </w:t>
-      </w:r>
-      <w:r>
-        <w:t xml:space="preserve">(deadline</w:t>
-      </w:r>
-      <w:r>
-        <w:t xml:space="preserve"> </w:t>
-      </w:r>
-      <w:r>
-        <w:t xml:space="preserve">31</w:t>
-      </w:r>
-      <w:r>
-        <w:t xml:space="preserve"> </w:t>
-      </w:r>
-      <w:r>
-        <w:t xml:space="preserve">December</w:t>
-      </w:r>
-      <w:r>
-        <w:t xml:space="preserve"> </w:t>
-      </w:r>
-      <w:r>
-        <w:t xml:space="preserve">2026)</w:t>
-      </w:r>
-    </w:p>
-    <w:bookmarkStart w:id="20" w:name="abstract"/>
-    <w:p>
-      <w:pPr>
-        <w:pStyle w:val="Heading1"/>
-      </w:pPr>
-      <w:r>
-        <w:t xml:space="preserve">Abstract</w:t>
-      </w:r>
+        <w:pStyle w:val="Author"/>
+      </w:pPr>
     </w:p>
     <w:p>
       <w:pPr>
@@ -378,23 +132,13 @@
           <w:bCs/>
           <w:b/>
         </w:rPr>
-        <w:t xml:space="preserve">What we will do.</w:t>
-      </w:r>
-      <w:r>
-        <w:t xml:space="preserve"> </w:t>
-      </w:r>
-      <w:r>
-        <w:t xml:space="preserve">Under the EU Ecodesign for Sustainable Products Regulation (2024/1781), every garment sold in the EU will carry a Digital Product Passport (DPP): a product-level record of fibre composition, origin by processing stage, substances of concern, footprint, durability and recyclability. The textile delegated act is planned for 2027. Meanwhile, the destruction ban on unsold apparel (in force since July 2026) and the live DPP Registry are already pushing documentation demands onto suppliers. Most passport data sit not with brands but with suppliers several tiers upstream in exporting countries. We ask:</w:t>
-      </w:r>
-      <w:r>
-        <w:t xml:space="preserve"> </w:t>
-      </w:r>
-      <w:r>
-        <w:rPr>
-          <w:iCs/>
-          <w:i/>
-        </w:rPr>
-        <w:t xml:space="preserve">How do apparel suppliers build the capacity to produce passport-grade data, and does that capacity become circular supply chain capability and export performance, or only paperwork?</w:t>
+        <w:t xml:space="preserve">What are we going to do?</w:t>
+      </w:r>
+      <w:r>
+        <w:t xml:space="preserve"> </w:t>
+      </w:r>
+      <w:r>
+        <w:t xml:space="preserve">The EU Ecodesign for Sustainable Products Regulation (2024/1781) will require every garment sold in the EU to carry a Digital Product Passport (DPP): a product-level record of composition, origin, chemicals, footprint, durability and recyclability. The textile delegated act is planned for 2027. The destruction ban on unsold apparel (in force since July 2026) and the live DPP Registry are already pushing documentation demands onto suppliers, who hold most passport data several tiers upstream. We ask how apparel suppliers build the capacity to produce passport-grade data, and whether that capacity becomes circular supply chain capability and export performance, or only paperwork.</w:t>
       </w:r>
     </w:p>
     <w:p>
@@ -406,13 +150,13 @@
           <w:bCs/>
           <w:b/>
         </w:rPr>
-        <w:t xml:space="preserve">Why readers should care.</w:t>
-      </w:r>
-      <w:r>
-        <w:t xml:space="preserve"> </w:t>
-      </w:r>
-      <w:r>
-        <w:t xml:space="preserve">India is at a pivot point. U.S. tariffs of up to 50% and the EU–India free trade agreement concluded in January 2026 are steering Indian exporters toward the EU, just as the EU makes product data a condition of market access. Choices made in 2027, before the mandate, will decide which suppliers remain in EU supply chains. For managers, the DPP is a supply chain design problem (who collects, standardises and shares which data, across how many tiers), not an IT purchase. For policymakers, it raises a question of distributive justice: who pays for transparency?</w:t>
+        <w:t xml:space="preserve">Why should readers care?</w:t>
+      </w:r>
+      <w:r>
+        <w:t xml:space="preserve"> </w:t>
+      </w:r>
+      <w:r>
+        <w:t xml:space="preserve">U.S. tariffs of up to 50% and the EU–India free trade agreement concluded in January 2026 are steering Indian exporters toward the EU, just as the EU makes product data a condition of market access. Choices made in 2027, before the mandate, will decide which suppliers remain in EU supply chains. For managers, the DPP is a supply chain design problem (who collects, standardises and shares which data, across how many tiers), not an IT purchase. For policymakers, it raises the question of who pays for transparency.</w:t>
       </w:r>
     </w:p>
     <w:p>
@@ -424,13 +168,13 @@
           <w:bCs/>
           <w:b/>
         </w:rPr>
-        <w:t xml:space="preserve">Theoretical lens.</w:t>
-      </w:r>
-      <w:r>
-        <w:t xml:space="preserve"> </w:t>
-      </w:r>
-      <w:r>
-        <w:t xml:space="preserve">We draw on organizational information processing theory. EU regulation, passed down through buyers, raises suppliers’ information-processing requirements. Suppliers respond by building vertical capacity (digital traceability) and lateral capacity (multi-tier data sharing), which we theorise to be complementary in producing passport readiness.</w:t>
+        <w:t xml:space="preserve">What is our theoretical lens?</w:t>
+      </w:r>
+      <w:r>
+        <w:t xml:space="preserve"> </w:t>
+      </w:r>
+      <w:r>
+        <w:t xml:space="preserve">Organizational information processing theory. EU regulation, passed down through buyers, raises suppliers’ information-processing requirements. Suppliers respond with vertical capacity (digital traceability) and lateral capacity (multi-tier data sharing), which we theorise to be complementary in producing passport readiness.</w:t>
       </w:r>
       <w:r>
         <w:t xml:space="preserve"> </w:t>
@@ -443,7 +187,7 @@
         <w:t xml:space="preserve">Data-appropriation concern</w:t>
       </w:r>
       <w:r>
-        <w:t xml:space="preserve">, the fear that shared data will be used to squeeze prices or switch suppliers, is expected to weaken how far buyer pressure turns into upstream sharing. Drawing on institutional theory, we test two competing expectations: readiness enables circular practices, or it is</w:t>
+        <w:t xml:space="preserve">, the fear that shared data will be used to squeeze prices or switch suppliers, should weaken how far buyer pressure turns into upstream sharing. Drawing on institutional theory, we test two competing expectations: readiness enables circular practices, or it is</w:t>
       </w:r>
       <w:r>
         <w:t xml:space="preserve"> </w:t>
@@ -471,13 +215,13 @@
           <w:bCs/>
           <w:b/>
         </w:rPr>
-        <w:t xml:space="preserve">Methodology and data.</w:t>
-      </w:r>
-      <w:r>
-        <w:t xml:space="preserve"> </w:t>
-      </w:r>
-      <w:r>
-        <w:t xml:space="preserve">In February and March 2027 we will run a two-wave key-informant survey of Indian textile and apparel exporters supplying EU buyers (target n ≥ 200). The sample will be drawn from the Apparel Export Promotion Council and cluster associations in Tiruppur, Bengaluru, NCR, Ludhiana and Kolkata. Predictors and outcomes are measured in separate waves to reduce common-method variance. We will estimate the model with PLS-SEM, including interaction effects and out-of-sample prediction (PLSpredict), and control for size, tier, vertical integration, certifications and regulatory uncertainty.</w:t>
+        <w:t xml:space="preserve">What is our methodology?</w:t>
+      </w:r>
+      <w:r>
+        <w:t xml:space="preserve"> </w:t>
+      </w:r>
+      <w:r>
+        <w:t xml:space="preserve">A two-wave key-informant survey separating predictors and outcomes to reduce common-method variance. The model is estimated with PLS-SEM, including interaction effects and out-of-sample prediction (PLSpredict), and controls for size, tier, vertical integration, certifications and regulatory uncertainty.</w:t>
       </w:r>
     </w:p>
     <w:p>
@@ -489,13 +233,31 @@
           <w:bCs/>
           <w:b/>
         </w:rPr>
-        <w:t xml:space="preserve">Expected contributions.</w:t>
-      </w:r>
-      <w:r>
-        <w:t xml:space="preserve"> </w:t>
-      </w:r>
-      <w:r>
-        <w:t xml:space="preserve">For theory, we extend information processing theory to regulation-induced, multi-tier information requirements and identify data-appropriation concern as a relational boundary condition. For practice, we offer suppliers and brands a passport-readiness diagnostic and evidence on whether to invest in systems, in supplier relationships, or in both. For policy, we show where shared data infrastructure, cost-sharing and data-use safeguards could close the</w:t>
+        <w:t xml:space="preserve">What data will we use?</w:t>
+      </w:r>
+      <w:r>
+        <w:t xml:space="preserve"> </w:t>
+      </w:r>
+      <w:r>
+        <w:t xml:space="preserve">Primary survey data collected in February–March 2027 from Indian textile and apparel exporters supplying EU buyers (target n ≥ 200). The sample is drawn from the Apparel Export Promotion Council and cluster associations in Tiruppur, Bengaluru, NCR, Ludhiana and Kolkata. Perceived performance is triangulated with change in EU export share.</w:t>
+      </w:r>
+    </w:p>
+    <w:p>
+      <w:pPr>
+        <w:pStyle w:val="BodyText"/>
+      </w:pPr>
+      <w:r>
+        <w:rPr>
+          <w:bCs/>
+          <w:b/>
+        </w:rPr>
+        <w:t xml:space="preserve">How will our findings influence theory and practice?</w:t>
+      </w:r>
+      <w:r>
+        <w:t xml:space="preserve"> </w:t>
+      </w:r>
+      <w:r>
+        <w:t xml:space="preserve">For theory, we extend information processing theory to regulation-induced, multi-tier information requirements and identify data-appropriation concern as a relational boundary condition. For practice, we offer suppliers and brands a passport-readiness diagnostic and evidence on whether to invest in systems, in supplier relationships, or both. For policy, we show where shared data infrastructure, cost-sharing and data-use safeguards could close the</w:t>
       </w:r>
       <w:r>
         <w:t xml:space="preserve"> </w:t>
@@ -531,10 +293,9 @@
         <w:t xml:space="preserve"> </w:t>
       </w:r>
       <w:r>
-        <w:t xml:space="preserve">digital product passport; circular economy; apparel supply chains; information processing theory; multi-tier traceability; India; PLS-SEM</w:t>
+        <w:t xml:space="preserve">digital product passport; circular economy; apparel supply chains; information processing theory; India</w:t>
       </w:r>
     </w:p>
-    <w:bookmarkEnd w:id="20"/>
     <w:sectPr/>
   </w:body>
 </w:document>

</xml_diff>

<commit_message>
Redesign study from PLS-SEM to fsQCA
- 40-60 exporters via single-session structured interviews (Dec 2026 -
  Feb 2027) instead of 200+ firms in two survey waves
- Configurational propositions P1-P4 (equifinal integrated/networked
  routes, DTC necessity, asymmetry, decoupling) replace H1-H6
- Factual checklists and theory-based calibration anchors replace new
  latent scales, so no EFA/CFA is needed
- QCA-package analysis script replaces the seminr/lavaan/EFA scripts
- New Figure 1, abstract (493 words), manuscript (3,654 words incl. refs)

Co-Authored-By: Claude Opus 5.5 <noreply@anthropic.com>
Claude-Session: https://claude.ai/code/session_01SPArV4q8dwhv3Npz3wnuCt
</commit_message>
<xml_diff>
--- a/dpp-textile-jbl/01_abstract.docx
+++ b/dpp-textile-jbl/01_abstract.docx
@@ -31,19 +31,31 @@
         <w:t xml:space="preserve"> </w:t>
       </w:r>
       <w:r>
+        <w:t xml:space="preserve">Configurations</w:t>
+      </w:r>
+      <w:r>
+        <w:t xml:space="preserve"> </w:t>
+      </w:r>
+      <w:r>
+        <w:t xml:space="preserve">of</w:t>
+      </w:r>
+      <w:r>
+        <w:t xml:space="preserve"> </w:t>
+      </w:r>
+      <w:r>
         <w:t xml:space="preserve">Supplier</w:t>
       </w:r>
       <w:r>
         <w:t xml:space="preserve"> </w:t>
       </w:r>
       <w:r>
-        <w:t xml:space="preserve">Information-Processing</w:t>
-      </w:r>
-      <w:r>
-        <w:t xml:space="preserve"> </w:t>
-      </w:r>
-      <w:r>
-        <w:t xml:space="preserve">Capacity,</w:t>
+        <w:t xml:space="preserve">Capacity</w:t>
+      </w:r>
+      <w:r>
+        <w:t xml:space="preserve"> </w:t>
+      </w:r>
+      <w:r>
+        <w:t xml:space="preserve">for</w:t>
       </w:r>
       <w:r>
         <w:t xml:space="preserve"> </w:t>
@@ -67,7 +79,7 @@
         <w:t xml:space="preserve"> </w:t>
       </w:r>
       <w:r>
-        <w:t xml:space="preserve">Readiness,</w:t>
+        <w:t xml:space="preserve">Readiness</w:t>
       </w:r>
       <w:r>
         <w:t xml:space="preserve"> </w:t>
@@ -79,19 +91,7 @@
         <w:t xml:space="preserve"> </w:t>
       </w:r>
       <w:r>
-        <w:t xml:space="preserve">Circular</w:t>
-      </w:r>
-      <w:r>
-        <w:t xml:space="preserve"> </w:t>
-      </w:r>
-      <w:r>
-        <w:t xml:space="preserve">Supply</w:t>
-      </w:r>
-      <w:r>
-        <w:t xml:space="preserve"> </w:t>
-      </w:r>
-      <w:r>
-        <w:t xml:space="preserve">Chains</w:t>
+        <w:t xml:space="preserve">Circularity</w:t>
       </w:r>
       <w:r>
         <w:t xml:space="preserve"> </w:t>
@@ -138,7 +138,7 @@
         <w:t xml:space="preserve"> </w:t>
       </w:r>
       <w:r>
-        <w:t xml:space="preserve">The EU Ecodesign for Sustainable Products Regulation (2024/1781) will require every garment sold in the EU to carry a Digital Product Passport (DPP): a product-level record of composition, origin, chemicals, footprint, durability and recyclability. The textile delegated act is planned for 2027. The destruction ban on unsold apparel (in force since July 2026) and the live DPP Registry are already pushing documentation demands onto suppliers, who hold most passport data several tiers upstream. We ask how apparel suppliers build the capacity to produce passport-grade data, and whether that capacity becomes circular supply chain capability and export performance, or only paperwork.</w:t>
+        <w:t xml:space="preserve">The EU Ecodesign for Sustainable Products Regulation (2024/1781) will require every garment sold in the EU to carry a Digital Product Passport (DPP): a product-level record of composition, origin, chemicals, footprint, durability and recyclability. The textile delegated act is planned for 2027. The destruction ban on unsold apparel (in force since July 2026) and the live DPP Registry are already pushing documentation demands onto suppliers, who hold most passport data several tiers upstream. We ask which combinations of supplier conditions lead to passport readiness, which lead to its absence, and whether readiness is enough for circularity.</w:t>
       </w:r>
     </w:p>
     <w:p>
@@ -156,7 +156,7 @@
         <w:t xml:space="preserve"> </w:t>
       </w:r>
       <w:r>
-        <w:t xml:space="preserve">U.S. tariffs of up to 50% and the EU–India free trade agreement concluded in January 2026 are steering Indian exporters toward the EU, just as the EU makes product data a condition of market access. Choices made in 2027, before the mandate, will decide which suppliers remain in EU supply chains. For managers, the DPP is a supply chain design problem (who collects, standardises and shares which data, across how many tiers), not an IT purchase. For policymakers, it raises the question of who pays for transparency.</w:t>
+        <w:t xml:space="preserve">U.S. tariffs of up to 50% and the EU–India free trade agreement concluded in January 2026 are steering Indian exporters toward the EU, just as the EU makes product data a condition of market access. Choices made in 2027, before the mandate, will decide which suppliers remain in EU supply chains. For managers, the DPP is a supply chain design problem, not an IT purchase. For policymakers, it raises the question of who pays for transparency.</w:t>
       </w:r>
     </w:p>
     <w:p>
@@ -174,7 +174,7 @@
         <w:t xml:space="preserve"> </w:t>
       </w:r>
       <w:r>
-        <w:t xml:space="preserve">Organizational information processing theory. EU regulation, passed down through buyers, raises suppliers’ information-processing requirements. Suppliers respond with vertical capacity (digital traceability) and lateral capacity (multi-tier data sharing), which we theorise to be complementary in producing passport readiness.</w:t>
+        <w:t xml:space="preserve">Organizational information processing theory, read configurationally. Galbraith’s design alternatives suggest equifinal routes to readiness: an</w:t>
       </w:r>
       <w:r>
         <w:t xml:space="preserve"> </w:t>
@@ -184,10 +184,39 @@
           <w:iCs/>
           <w:i/>
         </w:rPr>
-        <w:t xml:space="preserve">Data-appropriation concern</w:t>
-      </w:r>
-      <w:r>
-        <w:t xml:space="preserve">, the fear that shared data will be used to squeeze prices or switch suppliers, should weaken how far buyer pressure turns into upstream sharing. Drawing on institutional theory, we test two competing expectations: readiness enables circular practices, or it is</w:t>
+        <w:t xml:space="preserve">integrated</w:t>
+      </w:r>
+      <w:r>
+        <w:t xml:space="preserve"> </w:t>
+      </w:r>
+      <w:r>
+        <w:t xml:space="preserve">route (owning upstream stages) and a</w:t>
+      </w:r>
+      <w:r>
+        <w:t xml:space="preserve"> </w:t>
+      </w:r>
+      <w:r>
+        <w:rPr>
+          <w:iCs/>
+          <w:i/>
+        </w:rPr>
+        <w:t xml:space="preserve">networked</w:t>
+      </w:r>
+      <w:r>
+        <w:t xml:space="preserve"> </w:t>
+      </w:r>
+      <w:r>
+        <w:t xml:space="preserve">route (independent sub-suppliers sharing data), both requiring digital traceability. We expect buyer pressure to produce readiness only when suppliers do not fear their data will be used against them (</w:t>
+      </w:r>
+      <w:r>
+        <w:rPr>
+          <w:iCs/>
+          <w:i/>
+        </w:rPr>
+        <w:t xml:space="preserve">data-appropriation concern</w:t>
+      </w:r>
+      <w:r>
+        <w:t xml:space="preserve">). Drawing on institutional theory, we test whether readiness is sufficient for circular capability or</w:t>
       </w:r>
       <w:r>
         <w:t xml:space="preserve"> </w:t>
@@ -203,7 +232,7 @@
         <w:t xml:space="preserve"> </w:t>
       </w:r>
       <w:r>
-        <w:t xml:space="preserve">as ceremonial compliance.</w:t>
+        <w:t xml:space="preserve">from it.</w:t>
       </w:r>
     </w:p>
     <w:p>
@@ -221,7 +250,7 @@
         <w:t xml:space="preserve"> </w:t>
       </w:r>
       <w:r>
-        <w:t xml:space="preserve">A two-wave key-informant survey separating predictors and outcomes to reduce common-method variance. The model is estimated with PLS-SEM, including interaction effects and out-of-sample prediction (PLSpredict), and controls for size, tier, vertical integration, certifications and regulatory uncertainty.</w:t>
+        <w:t xml:space="preserve">Fuzzy-set qualitative comparative analysis (fsQCA), which identifies combinations of conditions sufficient or necessary for an outcome, allowing different explanations for success and failure. We use calibrated measures, necessity and sufficiency analyses for high and low readiness, a separate analysis for circular capability, and robustness tests on calibration and thresholds.</w:t>
       </w:r>
     </w:p>
     <w:p>
@@ -239,7 +268,7 @@
         <w:t xml:space="preserve"> </w:t>
       </w:r>
       <w:r>
-        <w:t xml:space="preserve">Primary survey data collected in February–March 2027 from Indian textile and apparel exporters supplying EU buyers (target n ≥ 200). The sample is drawn from the Apparel Export Promotion Council and cluster associations in Tiruppur, Bengaluru, NCR, Ludhiana and Kolkata. Perceived performance is triangulated with change in EU export share.</w:t>
+        <w:t xml:space="preserve">Primary data collected from December 2026 to February 2027 through structured interviews with 40–60 Indian textile and apparel exporters supplying EU buyers. Firms are sampled purposively for diversity across clusters (Tiruppur, Bengaluru, NCR, Ludhiana, Kolkata), tiers, sizes and integration. Most measures are factual checklists (e.g., passport data categories a firm can supply today), verified against documents where possible.</w:t>
       </w:r>
     </w:p>
     <w:p>
@@ -257,7 +286,7 @@
         <w:t xml:space="preserve"> </w:t>
       </w:r>
       <w:r>
-        <w:t xml:space="preserve">For theory, we extend information processing theory to regulation-induced, multi-tier information requirements and identify data-appropriation concern as a relational boundary condition. For practice, we offer suppliers and brands a passport-readiness diagnostic and evidence on whether to invest in systems, in supplier relationships, or both. For policy, we show where shared data infrastructure, cost-sharing and data-use safeguards could close the</w:t>
+        <w:t xml:space="preserve">For theory, we move information processing theory from a single notion of fit to equifinal routes under regulation-induced, multi-tier requirements, and we show when buyer pressure fails. For practice, we give suppliers alternative routes to readiness that fit their structure, and show brands why data-use safeguards matter. For policy, we show where shared cluster data platforms and safeguards could close the</w:t>
       </w:r>
       <w:r>
         <w:t xml:space="preserve"> </w:t>
@@ -293,7 +322,7 @@
         <w:t xml:space="preserve"> </w:t>
       </w:r>
       <w:r>
-        <w:t xml:space="preserve">digital product passport; circular economy; apparel supply chains; information processing theory; India</w:t>
+        <w:t xml:space="preserve">digital product passport; circular economy; apparel supply chains; information processing theory; fsQCA</w:t>
       </w:r>
     </w:p>
     <w:sectPr/>

</xml_diff>

<commit_message>
Sharpen abstract with owned/negotiated/borrowed theory; add illustrative abstract
Submission abstract states the rehearsal's theory as expectations (no
results claimed, since fieldwork follows the deadline). A watermarked
internal version shows the simulated results. Title aligned across files;
Panipat added to the quota grid.

Co-Authored-By: Claude Opus 5.5 <noreply@anthropic.com>
Claude-Session: https://claude.ai/code/session_01SPArV4q8dwhv3Npz3wnuCt
</commit_message>
<xml_diff>
--- a/dpp-textile-jbl/01_abstract.docx
+++ b/dpp-textile-jbl/01_abstract.docx
@@ -31,31 +31,37 @@
         <w:t xml:space="preserve"> </w:t>
       </w:r>
       <w:r>
-        <w:t xml:space="preserve">Configurations</w:t>
-      </w:r>
-      <w:r>
-        <w:t xml:space="preserve"> </w:t>
-      </w:r>
-      <w:r>
-        <w:t xml:space="preserve">of</w:t>
-      </w:r>
-      <w:r>
-        <w:t xml:space="preserve"> </w:t>
-      </w:r>
-      <w:r>
-        <w:t xml:space="preserve">Supplier</w:t>
-      </w:r>
-      <w:r>
-        <w:t xml:space="preserve"> </w:t>
-      </w:r>
-      <w:r>
-        <w:t xml:space="preserve">Capacity</w:t>
-      </w:r>
-      <w:r>
-        <w:t xml:space="preserve"> </w:t>
-      </w:r>
-      <w:r>
-        <w:t xml:space="preserve">for</w:t>
+        <w:t xml:space="preserve">Owned,</w:t>
+      </w:r>
+      <w:r>
+        <w:t xml:space="preserve"> </w:t>
+      </w:r>
+      <w:r>
+        <w:t xml:space="preserve">Negotiated</w:t>
+      </w:r>
+      <w:r>
+        <w:t xml:space="preserve"> </w:t>
+      </w:r>
+      <w:r>
+        <w:t xml:space="preserve">or</w:t>
+      </w:r>
+      <w:r>
+        <w:t xml:space="preserve"> </w:t>
+      </w:r>
+      <w:r>
+        <w:t xml:space="preserve">Borrowed</w:t>
+      </w:r>
+      <w:r>
+        <w:t xml:space="preserve"> </w:t>
+      </w:r>
+      <w:r>
+        <w:t xml:space="preserve">Routes</w:t>
+      </w:r>
+      <w:r>
+        <w:t xml:space="preserve"> </w:t>
+      </w:r>
+      <w:r>
+        <w:t xml:space="preserve">to</w:t>
       </w:r>
       <w:r>
         <w:t xml:space="preserve"> </w:t>
@@ -80,18 +86,6 @@
       </w:r>
       <w:r>
         <w:t xml:space="preserve">Readiness</w:t>
-      </w:r>
-      <w:r>
-        <w:t xml:space="preserve"> </w:t>
-      </w:r>
-      <w:r>
-        <w:t xml:space="preserve">and</w:t>
-      </w:r>
-      <w:r>
-        <w:t xml:space="preserve"> </w:t>
-      </w:r>
-      <w:r>
-        <w:t xml:space="preserve">Circularity</w:t>
       </w:r>
       <w:r>
         <w:t xml:space="preserve"> </w:t>
@@ -138,7 +132,7 @@
         <w:t xml:space="preserve"> </w:t>
       </w:r>
       <w:r>
-        <w:t xml:space="preserve">The EU Ecodesign for Sustainable Products Regulation (2024/1781) will require every garment sold in the EU to carry a Digital Product Passport (DPP): a product-level record of composition, origin, chemicals, footprint, durability and recyclability. The textile delegated act is planned for 2027. The destruction ban on unsold apparel (in force since July 2026) and the live DPP Registry are already pushing documentation demands onto suppliers, who hold most passport data several tiers upstream. We ask which combinations of supplier conditions lead to passport readiness, which lead to its absence, and whether readiness is enough for circularity.</w:t>
+        <w:t xml:space="preserve">The EU Ecodesign for Sustainable Products Regulation (2024/1781) will require every garment sold in the EU to carry a Digital Product Passport (DPP) recording composition, origin, chemicals, footprint, durability and recyclability. The textile delegated act is planned for 2027. The destruction ban on unsold apparel (since July 2026) and the live DPP Registry already push documentation demands onto suppliers, who hold most passport data several tiers upstream. We ask which combinations of supplier conditions produce passport readiness, which produce its absence, and whether readiness leads to circularity.</w:t>
       </w:r>
     </w:p>
     <w:p>
@@ -156,7 +150,7 @@
         <w:t xml:space="preserve"> </w:t>
       </w:r>
       <w:r>
-        <w:t xml:space="preserve">U.S. tariffs of up to 50% and the EU–India free trade agreement concluded in January 2026 are steering Indian exporters toward the EU, just as the EU makes product data a condition of market access. Choices made in 2027, before the mandate, will decide which suppliers remain in EU supply chains. For managers, the DPP is a supply chain design problem, not an IT purchase. For policymakers, it raises the question of who pays for transparency.</w:t>
+        <w:t xml:space="preserve">U.S. tariffs of up to 50% and the EU–India free trade agreement concluded in January 2026 are steering Indian exporters toward the EU, just as product data become a condition of market access. Choices made in 2027 will decide which suppliers stay in EU supply chains. For managers, the DPP is a supply chain design problem, not an IT purchase. For policymakers, it raises the question of who pays for transparency.</w:t>
       </w:r>
     </w:p>
     <w:p>
@@ -174,39 +168,58 @@
         <w:t xml:space="preserve"> </w:t>
       </w:r>
       <w:r>
-        <w:t xml:space="preserve">Organizational information processing theory, read configurationally. Galbraith’s design alternatives suggest equifinal routes to readiness: an</w:t>
+        <w:t xml:space="preserve">Organizational information processing theory, read configurationally. We expect suppliers to reach readiness by</w:t>
       </w:r>
       <w:r>
         <w:t xml:space="preserve"> </w:t>
       </w:r>
       <w:r>
         <w:rPr>
-          <w:iCs/>
-          <w:i/>
+          <w:bCs/>
+          <w:b/>
         </w:rPr>
-        <w:t xml:space="preserve">integrated</w:t>
-      </w:r>
-      <w:r>
-        <w:t xml:space="preserve"> </w:t>
-      </w:r>
-      <w:r>
-        <w:t xml:space="preserve">route (owning upstream stages) and a</w:t>
+        <w:t xml:space="preserve">owning</w:t>
+      </w:r>
+      <w:r>
+        <w:t xml:space="preserve"> </w:t>
+      </w:r>
+      <w:r>
+        <w:t xml:space="preserve">upstream data (vertical integration),</w:t>
       </w:r>
       <w:r>
         <w:t xml:space="preserve"> </w:t>
       </w:r>
       <w:r>
         <w:rPr>
-          <w:iCs/>
-          <w:i/>
+          <w:bCs/>
+          <w:b/>
         </w:rPr>
-        <w:t xml:space="preserve">networked</w:t>
-      </w:r>
-      <w:r>
-        <w:t xml:space="preserve"> </w:t>
-      </w:r>
-      <w:r>
-        <w:t xml:space="preserve">route (independent sub-suppliers sharing data), both requiring digital traceability. We expect buyer pressure to produce readiness only when suppliers do not fear their data will be used against them (</w:t>
+        <w:t xml:space="preserve">negotiating</w:t>
+      </w:r>
+      <w:r>
+        <w:t xml:space="preserve"> </w:t>
+      </w:r>
+      <w:r>
+        <w:t xml:space="preserve">for it (multi-tier sharing), or</w:t>
+      </w:r>
+      <w:r>
+        <w:t xml:space="preserve"> </w:t>
+      </w:r>
+      <w:r>
+        <w:rPr>
+          <w:bCs/>
+          <w:b/>
+        </w:rPr>
+        <w:t xml:space="preserve">borrowing</w:t>
+      </w:r>
+      <w:r>
+        <w:t xml:space="preserve"> </w:t>
+      </w:r>
+      <w:r>
+        <w:t xml:space="preserve">it (chain-of-custody certification such as GOTS or GRS), with no single route necessary. Because buyer pressure is near-universal, we expect</w:t>
+      </w:r>
+      <w:r>
+        <w:t xml:space="preserve"> </w:t>
       </w:r>
       <w:r>
         <w:rPr>
@@ -216,23 +229,22 @@
         <w:t xml:space="preserve">data-appropriation concern</w:t>
       </w:r>
       <w:r>
-        <w:t xml:space="preserve">). Drawing on institutional theory, we test whether readiness is sufficient for circular capability or</w:t>
-      </w:r>
-      <w:r>
-        <w:t xml:space="preserve"> </w:t>
-      </w:r>
-      <w:r>
-        <w:rPr>
-          <w:iCs/>
-          <w:i/>
-        </w:rPr>
-        <w:t xml:space="preserve">decoupled</w:t>
-      </w:r>
-      <w:r>
-        <w:t xml:space="preserve"> </w:t>
-      </w:r>
-      <w:r>
-        <w:t xml:space="preserve">from it.</w:t>
+        <w:t xml:space="preserve">, not pressure, to separate ready from unready firms. Drawing on institutional theory, we expect</w:t>
+      </w:r>
+      <w:r>
+        <w:t xml:space="preserve"> </w:t>
+      </w:r>
+      <w:r>
+        <w:t xml:space="preserve">“</w:t>
+      </w:r>
+      <w:r>
+        <w:t xml:space="preserve">two circularities</w:t>
+      </w:r>
+      <w:r>
+        <w:t xml:space="preserve">”</w:t>
+      </w:r>
+      <w:r>
+        <w:t xml:space="preserve">: informal, cost-driven loops (cutting-waste trade, surplus resale) that need no data, and formal, brand-led loops that readiness alone may not produce.</w:t>
       </w:r>
     </w:p>
     <w:p>
@@ -250,7 +262,7 @@
         <w:t xml:space="preserve"> </w:t>
       </w:r>
       <w:r>
-        <w:t xml:space="preserve">Fuzzy-set qualitative comparative analysis (fsQCA), which identifies combinations of conditions sufficient or necessary for an outcome, allowing different explanations for success and failure. We use calibrated measures, necessity and sufficiency analyses for high and low readiness, a separate analysis for circular capability, and robustness tests on calibration and thresholds.</w:t>
+        <w:t xml:space="preserve">Fuzzy-set qualitative comparative analysis (fsQCA), which identifies combinations of conditions sufficient or necessary for an outcome and allows different explanations for success and failure. We analyse high and low readiness, and formal and informal circularity separately, with robustness tests on calibration and thresholds.</w:t>
       </w:r>
     </w:p>
     <w:p>
@@ -268,7 +280,7 @@
         <w:t xml:space="preserve"> </w:t>
       </w:r>
       <w:r>
-        <w:t xml:space="preserve">Primary data collected from December 2026 to February 2027 through structured interviews with 40–60 Indian textile and apparel exporters supplying EU buyers. Firms are sampled purposively for diversity across clusters (Tiruppur, Bengaluru, NCR, Ludhiana, Kolkata), tiers, sizes and integration. Most measures are factual checklists (e.g., passport data categories a firm can supply today), verified against documents where possible.</w:t>
+        <w:t xml:space="preserve">Structured interviews, December 2026 to February 2027, with 40–60 Indian textile and apparel exporters supplying EU buyers. Firms are sampled for diversity across clusters (Tiruppur, Bengaluru, NCR, Ludhiana, Panipat, Kolkata), tiers, sizes and integration. Most measures are factual checklists (e.g., passport data categories a firm can supply today), verified against documents where possible.</w:t>
       </w:r>
     </w:p>
     <w:p>
@@ -286,7 +298,7 @@
         <w:t xml:space="preserve"> </w:t>
       </w:r>
       <w:r>
-        <w:t xml:space="preserve">For theory, we move information processing theory from a single notion of fit to equifinal routes under regulation-induced, multi-tier requirements, and we show when buyer pressure fails. For practice, we give suppliers alternative routes to readiness that fit their structure, and show brands why data-use safeguards matter. For policy, we show where shared cluster data platforms and safeguards could close the</w:t>
+        <w:t xml:space="preserve">For theory, we extend information processing theory from capacity inside the firm to capacity held in relationships and institutional infrastructure. We also show why pressure alone fails. For practice, we show suppliers which route fits their structure, and show brands that data-use safeguards matter more than more pressure. For policy, we show how recognising certification data, building cluster data platforms and seeing informal circularity could close the</w:t>
       </w:r>
       <w:r>
         <w:t xml:space="preserve"> </w:t>
@@ -304,7 +316,7 @@
         <w:t xml:space="preserve"> </w:t>
       </w:r>
       <w:r>
-        <w:t xml:space="preserve">without pushing small suppliers out of EU value chains.</w:t>
+        <w:t xml:space="preserve">without excluding small suppliers.</w:t>
       </w:r>
     </w:p>
     <w:p>
@@ -322,7 +334,7 @@
         <w:t xml:space="preserve"> </w:t>
       </w:r>
       <w:r>
-        <w:t xml:space="preserve">digital product passport; circular economy; apparel supply chains; information processing theory; fsQCA</w:t>
+        <w:t xml:space="preserve">digital product passport; circular economy; apparel supply chains; information processing theory; fsQCA; India</w:t>
       </w:r>
     </w:p>
     <w:sectPr/>

</xml_diff>